<commit_message>
feat: rania doc name
</commit_message>
<xml_diff>
--- a/CEEMA_Project_Guide.docx
+++ b/CEEMA_Project_Guide.docx
@@ -4390,7 +4390,10 @@
           </w:tcPr>
           <w:p>
             <w:r>
-              <w:t>Sara User</w:t>
+              <w:t>Rania</w:t>
+            </w:r>
+            <w:r>
+              <w:t xml:space="preserve"> User</w:t>
             </w:r>
           </w:p>
         </w:tc>
@@ -4400,7 +4403,10 @@
           </w:tcPr>
           <w:p>
             <w:r>
-              <w:t>sara@ceema.com</w:t>
+              <w:t>rania</w:t>
+            </w:r>
+            <w:r>
+              <w:t>@ceema.com</w:t>
             </w:r>
           </w:p>
         </w:tc>

</xml_diff>